<commit_message>
Checkpoint: SoporteYa Etapa 3 con aplicación pública enlazada en documentación y Word, cinco capturas reales, CRUD completo, roles, indicadores, seguridad y 12 pruebas aprobadas.
</commit_message>
<xml_diff>
--- a/artifacts/Proyecto_Integrador_Etapa_3_SoporteYa_Arturo_Vega_Castillo.docx
+++ b/artifacts/Proyecto_Integrador_Etapa_3_SoporteYa_Arturo_Vega_Castillo.docx
@@ -1814,6 +1814,22 @@
       <w:pPr>
         <w:spacing w:after="120"/>
       </w:pPr>
+    </w:p>
+    <w:p>
+      <w:pPr>
+        <w:widowControl/>
+        <w:spacing w:after="120" w:line="360" w:lineRule="auto"/>
+        <w:jc w:val="both"/>
+      </w:pPr>
+      <w:r>
+        <w:rPr>
+          <w:rFonts w:ascii="Arial" w:cs="Arial" w:eastAsia="Arial" w:hAnsi="Arial"/>
+          <w:color w:val="222222"/>
+          <w:sz w:val="22"/>
+          <w:szCs w:val="22"/>
+        </w:rPr>
+        <w:t xml:space="preserve">Aplicación publicada y verificada: https://soporteya-nogales.manus.space</w:t>
+      </w:r>
     </w:p>
     <w:p>
       <w:pPr>

</xml_diff>